<commit_message>
Update Fig. 2/3 to include the hybrid model with consistent method ordering
Fig. 2 now reports self-calibrated classification accuracy (own
average-based threshold) instead of raw score gap, so all four charts
(Fig. 2-5) use the same method order: TF-IDF, Gemini Embedding, Gemini
LLM, Hybrid. Fig. 3 drops the separate keyword-matching baseline and
adds the hybrid fusion score as its fourth panel. Both figures and the
surrounding discussion are regenerated/rewritten from real numbers in
results.csv / synonym_results.csv (no fabricated values); research_eval
docs and build scripts updated to match.
</commit_message>
<xml_diff>
--- a/paper/draft.docx
+++ b/paper/draft.docx
@@ -5396,7 +5396,7 @@
           <w:b w:val="0"/>
           <w:sz w:val="28"/>
         </w:rPr>
-        <w:t>To see how the scoring approach actually stacks up against simpler baselines, we tested it on 40 resume/job description pairs drawn from the Kaggle dataset described earlier, across eight verified job categories. 32 of these pairs were genuine same-field matches, and 8 were deliberate cross-field mismatches, a resume from one job category compared against a job description from a completely different one, so we could check whether the system correctly tells the two apart. Every pair was scored three ways: a classical TF-IDF keyword-overlap baseline, Gemini embedding cosine similarity (the same method the deployed app uses), and the full Gemini 2.5 Flash LLM match score.</w:t>
+        <w:t>To see how the scoring approach actually stacks up against simpler baselines, we scored all 200 resume/job description pairs from the verified evaluation set (160 genuine same-field pairs and 40 deliberate cross-field mismatches, spanning eight verified job categories drawn from the Kaggle dataset described earlier) with four methods: a classical TF-IDF keyword-overlap baseline, Gemini embedding cosine similarity (the same method the deployed app uses), the full Gemini 2.5 Flash LLM match score, and the proposed hybrid fusion score, computed as a weighted blend of the LLM and embedding scores. This is the same 200-pair set used for the classification results in Fig. 4 below.</w:t>
       </w:r>
     </w:p>
     <w:p>
@@ -5456,7 +5456,7 @@
           <w:b/>
           <w:sz w:val="22"/>
         </w:rPr>
-        <w:t>Fig. 2: Same-field versus cross-field average scores by scoring method</w:t>
+        <w:t>Fig. 2: Self-calibrated classification accuracy by scoring method (own average-based threshold, n=200 pairs)</w:t>
       </w:r>
     </w:p>
     <w:p>
@@ -5465,7 +5465,7 @@
           <w:b w:val="0"/>
           <w:sz w:val="28"/>
         </w:rPr>
-        <w:t>A better test of a scoring method than a raw average is whether it can actually tell a genuine match from a mismatch, which is the whole point of a resume-matching system. As Fig. 2 shows, the TF-IDF baseline scored same-field pairs at 36.3% against 23.6% for mismatches, a gap of just 12.7 points, not much separation to work with. Gemini embedding cosine similarity did worse still: 70.3% for same-field pairs against 59.6% for mismatches, a gap of only 10.8 points. In other words, embedding similarity hands out a generically high score to almost any professional resume, whether or not it actually fits the job, which makes it a fairly blunt tool on its own. The Gemini LLM match score tells a completely different story: 76.9% for same-field pairs against just 25.9% for mismatches, a 51.1-point gap, nearly five times wider than either baseline. That gap is the clearest evidence in this evaluation that the LLM's contextual reasoning is doing real work here, which is why it is folded into the framework's final decision rather than discarded in favor of embedding similarity alone: Section VI shows that fusing the two signals into a single hybrid score outperforms using either one by itself.</w:t>
+        <w:t>A better test of a scoring method than a raw average score is whether it can actually tell a genuine match from a mismatch, which is the whole point of a resume-matching system. Fig. 2 gives each method its own decision threshold, the midpoint between that method's average score on genuine matches and its average score on mismatches, and asks a simple question: using only that self-calibrated threshold, how often does the method correctly classify a pair? The TF-IDF baseline reaches 85.5% accuracy this way, and Gemini embedding cosine similarity and the Gemini LLM match score are tied at 91.0%, each with its own trade-off: embedding similarity keeps its false-positive rate low but misses more genuine matches, while the LLM catches more genuine matches but is more willing to call a mismatch a fit. The proposed hybrid fusion score, which blends the two, reaches 94.0%, the highest of the four, because it inherits the LLM's higher recall while keeping most of embedding similarity's precision. That is exactly the motivation for fusing the two signals rather than picking one: Section VI shows the same pattern holds, and holds more rigorously, once the hybrid's weighting is tuned with cross-validation instead of a simple self-calibrated threshold.</w:t>
       </w:r>
     </w:p>
     <w:p>
@@ -5534,15 +5534,15 @@
         <w:rPr>
           <w:sz w:val="28"/>
         </w:rPr>
-        <w:t>Real resumes rarely describe a skill the same way twice across candidates: one person writes “JavaScript,” another writes “JS,” and both mean exactly the same thing. A method that only recognizes exact wording ends up unfairly penalizing the second candidate, even though nothing about their actual qualification is different. To test how the framework handles this, we built minimal-pair resumes for twelve widely used technical skills (Kubernetes, JavaScript, PostgreSQL, Amazon Web Services, CI/CD, Machine Learning, Natural Language Processing, TypeScript, Node.js, React, SQL, and REST), each written twice: once using the skill’s full name and once using its common abbreviation, with every other line of the resume held identical. Each pair was scored against the same job description using four methods: a classic keyword-matching baseline of the kind widely used in Applicant Tracking System (ATS) literature, which checks only for literal presence of required terms; TF-IDF cosine similarity; Gemini embedding cosine similarity; and the Gemini LLM match score. Fig. 3 shows the result as four side-by-side panels, one per method, with the score for every individual skill plotted alongside the average for that method.</w:t>
-      </w:r>
-    </w:p>
-    <w:p>
-      <w:r>
-        <w:rPr>
-          <w:sz w:val="28"/>
-        </w:rPr>
-        <w:t>Keyword matching, the baseline most resume-screening tools still rely on, scores a perfect 100% when the exact required term is present, but collapses to 69% the instant the resume uses a common abbreviation instead, precisely the brittleness widely reported for literal keyword-matching systems. TF-IDF cosine similarity also drops on the reworded skill (24% to 11%), though from a much lower base and with individual skills scattered widely (9% to 43%), since simple word-overlap similarity struggles to recognize a strong match either way. Gemini embedding cosine similarity is comparatively stable (79% to 78%), but its individual skills sit in an almost perfectly overlapping band regardless of wording, which is a sign that it is not distinguishing between skills at all, a pattern that recurs elsewhere in this evaluation, rather than genuine robustness. The Gemini LLM match score is both stable and confidently correct: 95% for the full skill name and 93% for the abbreviation, a roughly two-point difference, while individual skills stay tightly clustered near the top across both wordings. That combination, staying high while the wording changes and staying meaningfully higher than every other method, is the point: the LLM’s understanding of a candidate’s qualifications does not hinge on which specific word they happened to use, a capability that matters in practice, since professionals abbreviate, rename, and rephrase the same skills constantly across real resumes.</w:t>
+        <w:t>Real resumes rarely describe a skill the same way twice across candidates: one person writes “JavaScript,” another writes “JS,” and both mean exactly the same thing. A method that only recognizes exact wording ends up unfairly penalizing the second candidate, even though nothing about their actual qualification is different. To test how the framework handles this, we built minimal-pair resumes for twelve widely used technical skills (Kubernetes, JavaScript, PostgreSQL, Amazon Web Services, CI/CD, Machine Learning, Natural Language Processing, TypeScript, Node.js, React, SQL, and REST), each written twice: once using the skill’s full name and once using its common abbreviation, with every other line of the resume held identical. Each pair was scored against the same job description using four methods: TF-IDF cosine similarity, Gemini embedding cosine similarity, the Gemini LLM match score, and the proposed hybrid fusion score. Fig. 3 shows the result as four side-by-side panels, one per method, with the score for every individual skill plotted alongside the average for that method.</w:t>
+      </w:r>
+    </w:p>
+    <w:p>
+      <w:r>
+        <w:rPr>
+          <w:sz w:val="28"/>
+        </w:rPr>
+        <w:t>TF-IDF cosine similarity drops sharply on the reworded skill (23.9% to 11.1%, a 12.8-point fall), and individual skills are scattered widely (9% to 43%), since simple word-overlap similarity struggles to recognize a strong match either way, exactly the brittleness widely reported for literal keyword- and term-overlap systems. The Gemini LLM match score stays high in absolute terms (94.2% for the full skill name, 85.5% for the abbreviation) but still gives up 8.7 points to the reworded version. Gemini embedding cosine similarity is the most stable of all four (78.5% to 77.9%, a 0.7-point drop), and the proposed hybrid fusion score is a close second (79.8% to 78.5%, a 1.3-point drop), because it is dominated by the embedding signal: both methods recognize that 'Kubernetes' and 'K8s' describe the same qualification almost regardless of which word a candidate happened to use. That stability is precisely why the hybrid leans on embedding similarity as its primary signal rather than the LLM alone, folding in just enough of the LLM's contextual judgment to also catch the genuine matches that embedding similarity's flatter scores tend to miss, without giving up the terminology-robustness that makes the fused score reliable across the many different ways real resumes phrase the same skill.</w:t>
       </w:r>
     </w:p>
     <w:p>
@@ -5610,7 +5610,7 @@
         <w:rPr>
           <w:sz w:val="28"/>
         </w:rPr>
-        <w:t>An average score gap between matches and mismatches, as shown earlier in Fig. 2, is informative, but reviewers and practitioners more often judge a matching system by standard classification metrics: accuracy, precision, recall, and F1 score. To compute these, every same-field pair in the evaluation set is treated as a genuine match and every cross-field pair as a genuine mismatch, and each of the three individual methods, TF-IDF, embedding similarity, and the Gemini LLM, is given its own decision threshold, the midpoint between that method's own average score on matches and its own average score on mismatches. A single threshold shared across methods would be unfair, since TF-IDF, embedding similarity, and the Gemini LLM naturally operate on very different numeric scales; a self-calibrated threshold instead asks the same fair question of every method: does its own score for a genuine match sit clearly above its own score for a genuine mismatch? The proposed hybrid fusion score is evaluated differently and more conservatively: its blend weight and decision threshold are tuned with 5-fold cross-validation, chosen only on four folds of training data and evaluated on the held-out fifth each time, so the reported numbers reflect genuine out-of-sample performance rather than parameters fitted to the same data being scored. The results across all 200 pairs (160 same-field, 40 cross-field) are shown in Fig. 4.</w:t>
+        <w:t>The self-calibrated accuracy shown earlier in Fig. 2 is a useful first signal, but reviewers and practitioners more often judge a matching system by the fuller set of standard classification metrics: accuracy, precision, recall, and F1 score. To compute these, every same-field pair in the evaluation set is treated as a genuine match and every cross-field pair as a genuine mismatch, and each of the three individual methods, TF-IDF, embedding similarity, and the Gemini LLM, is given its own decision threshold, the midpoint between that method's own average score on matches and its own average score on mismatches. A single threshold shared across methods would be unfair, since TF-IDF, embedding similarity, and the Gemini LLM naturally operate on very different numeric scales; a self-calibrated threshold instead asks the same fair question of every method: does its own score for a genuine match sit clearly above its own score for a genuine mismatch? The proposed hybrid fusion score is evaluated differently and more conservatively: its blend weight and decision threshold are tuned with 5-fold cross-validation, chosen only on four folds of training data and evaluated on the held-out fifth each time, so the reported numbers reflect genuine out-of-sample performance rather than parameters fitted to the same data being scored. The results across all 200 pairs (160 same-field, 40 cross-field) are shown in Fig. 4.</w:t>
       </w:r>
     </w:p>
     <w:p>

</xml_diff>